<commit_message>
docs(bolsillos): evidencia completa de refactorizacion en el informe
Amplia la seccion 5: dos refactors (complejidad UpdatePocket + node:crypto),
tabla de commits, diff de codigo, smells eliminados (S3776, S7772) y estado
final del modulo (0 smells, 100% cobertura).

Co-Authored-By: Claude Opus 4.8 <noreply@anthropic.com>
</commit_message>
<xml_diff>
--- a/docs/informe-resultados-bolsillos.docx
+++ b/docs/informe-resultados-bolsillos.docx
@@ -2738,17 +2738,141 @@
         <w:pStyle w:val="Heading1"/>
       </w:pPr>
       <w:r>
-        <w:t>5. Refactorización</w:t>
+        <w:t>5. Refactorización del módulo Bolsillos</w:t>
       </w:r>
     </w:p>
     <w:p>
       <w:r>
-        <w:t>Unidad refactorizada: UpdatePocket.execute — la de mayor complejidad según ambos análisis.</w:t>
+        <w:t>Se aplicaron dos refactorizaciones sobre Bolsillos, ambas verificadas con las 58 pruebas unitarias (comportamiento idéntico) y la cobertura en 100%. Trazabilidad en la rama tests/bolsillos-unitarias-aaa:</w:t>
+      </w:r>
+    </w:p>
+    <w:tbl>
+      <w:tblPr>
+        <w:tblStyle w:val="TableGrid"/>
+        <w:tblW w:type="auto" w:w="0"/>
+        <w:jc w:val="center"/>
+        <w:tblLook w:firstColumn="1" w:firstRow="1" w:lastColumn="0" w:lastRow="0" w:noHBand="0" w:noVBand="1" w:val="04A0"/>
+      </w:tblPr>
+      <w:tblGrid>
+        <w:gridCol w:w="4320"/>
+        <w:gridCol w:w="4320"/>
+      </w:tblGrid>
+      <w:tr>
+        <w:tc>
+          <w:tcPr>
+            <w:tcW w:type="dxa" w:w="1872"/>
+            <w:shd w:val="clear" w:fill="1F4E79"/>
+          </w:tcPr>
+          <w:p>
+            <w:r/>
+            <w:r>
+              <w:rPr>
+                <w:b/>
+                <w:color w:val="FFFFFF"/>
+                <w:sz w:val="19"/>
+              </w:rPr>
+              <w:t>Commit</w:t>
+            </w:r>
+          </w:p>
+        </w:tc>
+        <w:tc>
+          <w:tcPr>
+            <w:tcW w:type="dxa" w:w="7488"/>
+            <w:shd w:val="clear" w:fill="1F4E79"/>
+          </w:tcPr>
+          <w:p>
+            <w:r/>
+            <w:r>
+              <w:rPr>
+                <w:b/>
+                <w:color w:val="FFFFFF"/>
+                <w:sz w:val="19"/>
+              </w:rPr>
+              <w:t>Refactorización</w:t>
+            </w:r>
+          </w:p>
+        </w:tc>
+      </w:tr>
+      <w:tr>
+        <w:tc>
+          <w:tcPr>
+            <w:tcW w:type="dxa" w:w="1872"/>
+          </w:tcPr>
+          <w:p>
+            <w:r/>
+            <w:r>
+              <w:rPr>
+                <w:sz w:val="18"/>
+              </w:rPr>
+              <w:t>6775c44</w:t>
+            </w:r>
+          </w:p>
+        </w:tc>
+        <w:tc>
+          <w:tcPr>
+            <w:tcW w:type="dxa" w:w="7488"/>
+          </w:tcPr>
+          <w:p>
+            <w:r/>
+            <w:r>
+              <w:rPr>
+                <w:sz w:val="18"/>
+              </w:rPr>
+              <w:t>Reducción de complejidad de UpdatePocket (Extract Method)</w:t>
+            </w:r>
+          </w:p>
+        </w:tc>
+      </w:tr>
+      <w:tr>
+        <w:tc>
+          <w:tcPr>
+            <w:tcW w:type="dxa" w:w="1872"/>
+            <w:shd w:val="clear" w:fill="EAF1F8"/>
+          </w:tcPr>
+          <w:p>
+            <w:r/>
+            <w:r>
+              <w:rPr>
+                <w:sz w:val="18"/>
+              </w:rPr>
+              <w:t>a1e74cc</w:t>
+            </w:r>
+          </w:p>
+        </w:tc>
+        <w:tc>
+          <w:tcPr>
+            <w:tcW w:type="dxa" w:w="7488"/>
+            <w:shd w:val="clear" w:fill="EAF1F8"/>
+          </w:tcPr>
+          <w:p>
+            <w:r/>
+            <w:r>
+              <w:rPr>
+                <w:sz w:val="18"/>
+              </w:rPr>
+              <w:t>Uso de node:crypto en los casos de uso</w:t>
+            </w:r>
+          </w:p>
+        </w:tc>
+      </w:tr>
+    </w:tbl>
+    <w:p/>
+    <w:p>
+      <w:pPr>
+        <w:pStyle w:val="Heading2"/>
+      </w:pPr>
+      <w:r>
+        <w:t>5.1 Reducción de complejidad de UpdatePocket — smell S3776 (CRITICAL)</w:t>
       </w:r>
     </w:p>
     <w:p>
       <w:r>
-        <w:t>Técnica: Extract Method — se dividió el método monolítico en cuatro métodos privados con responsabilidad única (validateInput, loadAuthorized, adjustAmount, notify) y se adelantó la validación de 'sin cambios' (falla rápido antes de tocar la base de datos).</w:t>
+        <w:t>UpdatePocket.execute era la unidad más compleja según ambos análisis (ciclomática 17, cognitiva 16). SonarQube marcaba: 'Refactor this function to reduce its Cognitive Complexity from 16 to the 15 allowed'.</w:t>
+      </w:r>
+    </w:p>
+    <w:p>
+      <w:r>
+        <w:t>Técnica: Extract Method — el método monolítico se dividió en cuatro métodos privados con responsabilidad única (validateInput, loadAuthorized, adjustAmount, notify) y se adelantó la validación de 'sin cambios' (falla rápido antes de tocar la base de datos).</w:t>
       </w:r>
     </w:p>
     <w:tbl>
@@ -2963,7 +3087,7 @@
               <w:rPr>
                 <w:sz w:val="18"/>
               </w:rPr>
-              <w:t>Code smell 'Cognitive Complexity too high'</w:t>
+              <w:t>Smell S3776 'Cognitive Complexity too high'</w:t>
             </w:r>
           </w:p>
         </w:tc>
@@ -3001,8 +3125,563 @@
     </w:tbl>
     <w:p/>
     <w:p>
+      <w:pPr>
+        <w:pStyle w:val="Heading2"/>
+      </w:pPr>
       <w:r>
-        <w:t>Verificación: las 58 pruebas unitarias siguen en verde y la cobertura del módulo se mantiene en 100% (líneas y ramas) — el comportamiento observable es idéntico.</w:t>
+        <w:t>5.2 Uso de node:crypto — smell S7772 (MINOR)</w:t>
+      </w:r>
+    </w:p>
+    <w:p>
+      <w:r>
+        <w:t>SonarQube marcaba 'Prefer node:crypto over crypto' en los casos de uso que generan UUID. Se corrigió el import en los cuatro archivos afectados:</w:t>
+      </w:r>
+    </w:p>
+    <w:p>
+      <w:r>
+        <w:rPr>
+          <w:rFonts w:ascii="Consolas" w:hAnsi="Consolas"/>
+          <w:color w:val="C62828"/>
+          <w:sz w:val="18"/>
+        </w:rPr>
+        <w:t>-  import { randomUUID } from 'crypto';</w:t>
+      </w:r>
+    </w:p>
+    <w:p>
+      <w:r>
+        <w:rPr>
+          <w:rFonts w:ascii="Consolas" w:hAnsi="Consolas"/>
+          <w:color w:val="2E7D32"/>
+          <w:sz w:val="18"/>
+        </w:rPr>
+        <w:t>+  import { randomUUID } from 'node:crypto';</w:t>
+      </w:r>
+    </w:p>
+    <w:p>
+      <w:r>
+        <w:t>Archivos: CreatePocket.ts, UpdatePocket.ts, DeletePocket.ts, TransferPocketBalance.ts.</w:t>
+      </w:r>
+    </w:p>
+    <w:p>
+      <w:pPr>
+        <w:pStyle w:val="Heading2"/>
+      </w:pPr>
+      <w:r>
+        <w:t>5.3 Code smells eliminados (evidencia)</w:t>
+      </w:r>
+    </w:p>
+    <w:tbl>
+      <w:tblPr>
+        <w:tblStyle w:val="TableGrid"/>
+        <w:tblW w:type="auto" w:w="0"/>
+        <w:jc w:val="center"/>
+        <w:tblLook w:firstColumn="1" w:firstRow="1" w:lastColumn="0" w:lastRow="0" w:noHBand="0" w:noVBand="1" w:val="04A0"/>
+      </w:tblPr>
+      <w:tblGrid>
+        <w:gridCol w:w="1728"/>
+        <w:gridCol w:w="1728"/>
+        <w:gridCol w:w="1728"/>
+        <w:gridCol w:w="1728"/>
+        <w:gridCol w:w="1728"/>
+      </w:tblGrid>
+      <w:tr>
+        <w:tc>
+          <w:tcPr>
+            <w:tcW w:type="dxa" w:w="1152"/>
+            <w:shd w:val="clear" w:fill="1F4E79"/>
+          </w:tcPr>
+          <w:p>
+            <w:r/>
+            <w:r>
+              <w:rPr>
+                <w:b/>
+                <w:color w:val="FFFFFF"/>
+                <w:sz w:val="19"/>
+              </w:rPr>
+              <w:t>Regla</w:t>
+            </w:r>
+          </w:p>
+        </w:tc>
+        <w:tc>
+          <w:tcPr>
+            <w:tcW w:type="dxa" w:w="3312"/>
+            <w:shd w:val="clear" w:fill="1F4E79"/>
+          </w:tcPr>
+          <w:p>
+            <w:r/>
+            <w:r>
+              <w:rPr>
+                <w:b/>
+                <w:color w:val="FFFFFF"/>
+                <w:sz w:val="19"/>
+              </w:rPr>
+              <w:t>Descripción</w:t>
+            </w:r>
+          </w:p>
+        </w:tc>
+        <w:tc>
+          <w:tcPr>
+            <w:tcW w:type="dxa" w:w="3024"/>
+            <w:shd w:val="clear" w:fill="1F4E79"/>
+          </w:tcPr>
+          <w:p>
+            <w:r/>
+            <w:r>
+              <w:rPr>
+                <w:b/>
+                <w:color w:val="FFFFFF"/>
+                <w:sz w:val="19"/>
+              </w:rPr>
+              <w:t>Archivos</w:t>
+            </w:r>
+          </w:p>
+        </w:tc>
+        <w:tc>
+          <w:tcPr>
+            <w:tcW w:type="dxa" w:w="1224"/>
+            <w:shd w:val="clear" w:fill="1F4E79"/>
+          </w:tcPr>
+          <w:p>
+            <w:r/>
+            <w:r>
+              <w:rPr>
+                <w:b/>
+                <w:color w:val="FFFFFF"/>
+                <w:sz w:val="19"/>
+              </w:rPr>
+              <w:t>Severidad</w:t>
+            </w:r>
+          </w:p>
+        </w:tc>
+        <w:tc>
+          <w:tcPr>
+            <w:tcW w:type="dxa" w:w="1296"/>
+            <w:shd w:val="clear" w:fill="1F4E79"/>
+          </w:tcPr>
+          <w:p>
+            <w:r/>
+            <w:r>
+              <w:rPr>
+                <w:b/>
+                <w:color w:val="FFFFFF"/>
+                <w:sz w:val="19"/>
+              </w:rPr>
+              <w:t>Estado</w:t>
+            </w:r>
+          </w:p>
+        </w:tc>
+      </w:tr>
+      <w:tr>
+        <w:tc>
+          <w:tcPr>
+            <w:tcW w:type="dxa" w:w="1152"/>
+          </w:tcPr>
+          <w:p>
+            <w:r/>
+            <w:r>
+              <w:rPr>
+                <w:sz w:val="18"/>
+              </w:rPr>
+              <w:t>S3776</w:t>
+            </w:r>
+          </w:p>
+        </w:tc>
+        <w:tc>
+          <w:tcPr>
+            <w:tcW w:type="dxa" w:w="3312"/>
+          </w:tcPr>
+          <w:p>
+            <w:r/>
+            <w:r>
+              <w:rPr>
+                <w:sz w:val="18"/>
+              </w:rPr>
+              <w:t>Complejidad cognitiva 16 &gt; 15</w:t>
+            </w:r>
+          </w:p>
+        </w:tc>
+        <w:tc>
+          <w:tcPr>
+            <w:tcW w:type="dxa" w:w="3024"/>
+          </w:tcPr>
+          <w:p>
+            <w:r/>
+            <w:r>
+              <w:rPr>
+                <w:sz w:val="18"/>
+              </w:rPr>
+              <w:t>UpdatePocket.ts</w:t>
+            </w:r>
+          </w:p>
+        </w:tc>
+        <w:tc>
+          <w:tcPr>
+            <w:tcW w:type="dxa" w:w="1224"/>
+          </w:tcPr>
+          <w:p>
+            <w:r/>
+            <w:r>
+              <w:rPr>
+                <w:sz w:val="18"/>
+              </w:rPr>
+              <w:t>CRITICAL</w:t>
+            </w:r>
+          </w:p>
+        </w:tc>
+        <w:tc>
+          <w:tcPr>
+            <w:tcW w:type="dxa" w:w="1296"/>
+          </w:tcPr>
+          <w:p>
+            <w:r/>
+            <w:r>
+              <w:rPr>
+                <w:sz w:val="18"/>
+              </w:rPr>
+              <w:t>Eliminado</w:t>
+            </w:r>
+          </w:p>
+        </w:tc>
+      </w:tr>
+      <w:tr>
+        <w:tc>
+          <w:tcPr>
+            <w:tcW w:type="dxa" w:w="1152"/>
+            <w:shd w:val="clear" w:fill="EAF1F8"/>
+          </w:tcPr>
+          <w:p>
+            <w:r/>
+            <w:r>
+              <w:rPr>
+                <w:sz w:val="18"/>
+              </w:rPr>
+              <w:t>S7772</w:t>
+            </w:r>
+          </w:p>
+        </w:tc>
+        <w:tc>
+          <w:tcPr>
+            <w:tcW w:type="dxa" w:w="3312"/>
+            <w:shd w:val="clear" w:fill="EAF1F8"/>
+          </w:tcPr>
+          <w:p>
+            <w:r/>
+            <w:r>
+              <w:rPr>
+                <w:sz w:val="18"/>
+              </w:rPr>
+              <w:t>Preferir node:crypto sobre crypto</w:t>
+            </w:r>
+          </w:p>
+        </w:tc>
+        <w:tc>
+          <w:tcPr>
+            <w:tcW w:type="dxa" w:w="3024"/>
+            <w:shd w:val="clear" w:fill="EAF1F8"/>
+          </w:tcPr>
+          <w:p>
+            <w:r/>
+            <w:r>
+              <w:rPr>
+                <w:sz w:val="18"/>
+              </w:rPr>
+              <w:t>Create · Update · Delete · Transfer</w:t>
+            </w:r>
+          </w:p>
+        </w:tc>
+        <w:tc>
+          <w:tcPr>
+            <w:tcW w:type="dxa" w:w="1224"/>
+            <w:shd w:val="clear" w:fill="EAF1F8"/>
+          </w:tcPr>
+          <w:p>
+            <w:r/>
+            <w:r>
+              <w:rPr>
+                <w:sz w:val="18"/>
+              </w:rPr>
+              <w:t>MINOR</w:t>
+            </w:r>
+          </w:p>
+        </w:tc>
+        <w:tc>
+          <w:tcPr>
+            <w:tcW w:type="dxa" w:w="1296"/>
+            <w:shd w:val="clear" w:fill="EAF1F8"/>
+          </w:tcPr>
+          <w:p>
+            <w:r/>
+            <w:r>
+              <w:rPr>
+                <w:sz w:val="18"/>
+              </w:rPr>
+              <w:t>Eliminado</w:t>
+            </w:r>
+          </w:p>
+        </w:tc>
+      </w:tr>
+    </w:tbl>
+    <w:p/>
+    <w:p>
+      <w:pPr>
+        <w:pStyle w:val="Heading2"/>
+      </w:pPr>
+      <w:r>
+        <w:t>5.4 Estado final del módulo Bolsillos</w:t>
+      </w:r>
+    </w:p>
+    <w:tbl>
+      <w:tblPr>
+        <w:tblStyle w:val="TableGrid"/>
+        <w:tblW w:type="auto" w:w="0"/>
+        <w:jc w:val="center"/>
+        <w:tblLook w:firstColumn="1" w:firstRow="1" w:lastColumn="0" w:lastRow="0" w:noHBand="0" w:noVBand="1" w:val="04A0"/>
+      </w:tblPr>
+      <w:tblGrid>
+        <w:gridCol w:w="2880"/>
+        <w:gridCol w:w="2880"/>
+        <w:gridCol w:w="2880"/>
+      </w:tblGrid>
+      <w:tr>
+        <w:tc>
+          <w:tcPr>
+            <w:tcW w:type="dxa" w:w="4320"/>
+            <w:shd w:val="clear" w:fill="1F4E79"/>
+          </w:tcPr>
+          <w:p>
+            <w:r/>
+            <w:r>
+              <w:rPr>
+                <w:b/>
+                <w:color w:val="FFFFFF"/>
+                <w:sz w:val="19"/>
+              </w:rPr>
+              <w:t>Indicador</w:t>
+            </w:r>
+          </w:p>
+        </w:tc>
+        <w:tc>
+          <w:tcPr>
+            <w:tcW w:type="dxa" w:w="2448"/>
+            <w:shd w:val="clear" w:fill="1F4E79"/>
+          </w:tcPr>
+          <w:p>
+            <w:r/>
+            <w:r>
+              <w:rPr>
+                <w:b/>
+                <w:color w:val="FFFFFF"/>
+                <w:sz w:val="19"/>
+              </w:rPr>
+              <w:t>Antes (1.ª corrida)</w:t>
+            </w:r>
+          </w:p>
+        </w:tc>
+        <w:tc>
+          <w:tcPr>
+            <w:tcW w:type="dxa" w:w="2592"/>
+            <w:shd w:val="clear" w:fill="1F4E79"/>
+          </w:tcPr>
+          <w:p>
+            <w:r/>
+            <w:r>
+              <w:rPr>
+                <w:b/>
+                <w:color w:val="FFFFFF"/>
+                <w:sz w:val="19"/>
+              </w:rPr>
+              <w:t>Después (esperado 2.ª corrida)</w:t>
+            </w:r>
+          </w:p>
+        </w:tc>
+      </w:tr>
+      <w:tr>
+        <w:tc>
+          <w:tcPr>
+            <w:tcW w:type="dxa" w:w="4320"/>
+          </w:tcPr>
+          <w:p>
+            <w:r/>
+            <w:r>
+              <w:rPr>
+                <w:sz w:val="18"/>
+              </w:rPr>
+              <w:t>Code smells</w:t>
+            </w:r>
+          </w:p>
+        </w:tc>
+        <w:tc>
+          <w:tcPr>
+            <w:tcW w:type="dxa" w:w="2448"/>
+          </w:tcPr>
+          <w:p>
+            <w:r/>
+            <w:r>
+              <w:rPr>
+                <w:sz w:val="18"/>
+              </w:rPr>
+              <w:t>4 (1 crítico + 3 menores)</w:t>
+            </w:r>
+          </w:p>
+        </w:tc>
+        <w:tc>
+          <w:tcPr>
+            <w:tcW w:type="dxa" w:w="2592"/>
+          </w:tcPr>
+          <w:p>
+            <w:r/>
+            <w:r>
+              <w:rPr>
+                <w:sz w:val="18"/>
+              </w:rPr>
+              <w:t>0</w:t>
+            </w:r>
+          </w:p>
+        </w:tc>
+      </w:tr>
+      <w:tr>
+        <w:tc>
+          <w:tcPr>
+            <w:tcW w:type="dxa" w:w="4320"/>
+            <w:shd w:val="clear" w:fill="EAF1F8"/>
+          </w:tcPr>
+          <w:p>
+            <w:r/>
+            <w:r>
+              <w:rPr>
+                <w:sz w:val="18"/>
+              </w:rPr>
+              <w:t>Complejidad cognitiva máx. por función</w:t>
+            </w:r>
+          </w:p>
+        </w:tc>
+        <w:tc>
+          <w:tcPr>
+            <w:tcW w:type="dxa" w:w="2448"/>
+            <w:shd w:val="clear" w:fill="EAF1F8"/>
+          </w:tcPr>
+          <w:p>
+            <w:r/>
+            <w:r>
+              <w:rPr>
+                <w:sz w:val="18"/>
+              </w:rPr>
+              <w:t>16</w:t>
+            </w:r>
+          </w:p>
+        </w:tc>
+        <w:tc>
+          <w:tcPr>
+            <w:tcW w:type="dxa" w:w="2592"/>
+            <w:shd w:val="clear" w:fill="EAF1F8"/>
+          </w:tcPr>
+          <w:p>
+            <w:r/>
+            <w:r>
+              <w:rPr>
+                <w:sz w:val="18"/>
+              </w:rPr>
+              <w:t>6</w:t>
+            </w:r>
+          </w:p>
+        </w:tc>
+      </w:tr>
+      <w:tr>
+        <w:tc>
+          <w:tcPr>
+            <w:tcW w:type="dxa" w:w="4320"/>
+          </w:tcPr>
+          <w:p>
+            <w:r/>
+            <w:r>
+              <w:rPr>
+                <w:sz w:val="18"/>
+              </w:rPr>
+              <w:t>Bugs / Vulnerabilidades</w:t>
+            </w:r>
+          </w:p>
+        </w:tc>
+        <w:tc>
+          <w:tcPr>
+            <w:tcW w:type="dxa" w:w="2448"/>
+          </w:tcPr>
+          <w:p>
+            <w:r/>
+            <w:r>
+              <w:rPr>
+                <w:sz w:val="18"/>
+              </w:rPr>
+              <w:t>0 / 0</w:t>
+            </w:r>
+          </w:p>
+        </w:tc>
+        <w:tc>
+          <w:tcPr>
+            <w:tcW w:type="dxa" w:w="2592"/>
+          </w:tcPr>
+          <w:p>
+            <w:r/>
+            <w:r>
+              <w:rPr>
+                <w:sz w:val="18"/>
+              </w:rPr>
+              <w:t>0 / 0</w:t>
+            </w:r>
+          </w:p>
+        </w:tc>
+      </w:tr>
+      <w:tr>
+        <w:tc>
+          <w:tcPr>
+            <w:tcW w:type="dxa" w:w="4320"/>
+            <w:shd w:val="clear" w:fill="EAF1F8"/>
+          </w:tcPr>
+          <w:p>
+            <w:r/>
+            <w:r>
+              <w:rPr>
+                <w:sz w:val="18"/>
+              </w:rPr>
+              <w:t>Cobertura del módulo</w:t>
+            </w:r>
+          </w:p>
+        </w:tc>
+        <w:tc>
+          <w:tcPr>
+            <w:tcW w:type="dxa" w:w="2448"/>
+            <w:shd w:val="clear" w:fill="EAF1F8"/>
+          </w:tcPr>
+          <w:p>
+            <w:r/>
+            <w:r>
+              <w:rPr>
+                <w:sz w:val="18"/>
+              </w:rPr>
+              <w:t>89.8%–97.8% por archivo</w:t>
+            </w:r>
+          </w:p>
+        </w:tc>
+        <w:tc>
+          <w:tcPr>
+            <w:tcW w:type="dxa" w:w="2592"/>
+            <w:shd w:val="clear" w:fill="EAF1F8"/>
+          </w:tcPr>
+          <w:p>
+            <w:r/>
+            <w:r>
+              <w:rPr>
+                <w:sz w:val="18"/>
+              </w:rPr>
+              <w:t>100%</w:t>
+            </w:r>
+          </w:p>
+        </w:tc>
+      </w:tr>
+    </w:tbl>
+    <w:p/>
+    <w:p>
+      <w:r>
+        <w:t>Verificación local: tras ambas refactorizaciones, las 58 pruebas unitarias siguen en verde y la cobertura del módulo se mantiene en 100% (líneas y ramas).</w:t>
       </w:r>
     </w:p>
     <w:p>
@@ -3013,7 +3692,7 @@
         <w:t xml:space="preserve">Pendiente: </w:t>
       </w:r>
       <w:r>
-        <w:t>reejecutar SonarQube con la rama integrada para reflejar la cobertura de Bolsillos al 100% y la caída de complejidad/deuda de UpdatePocket. Los valores 'después' son los esperados; la 2.ª instantánea los confirmará.</w:t>
+        <w:t>reejecutar SonarQube con la rama integrada para reflejar la 2.ª instantánea (Bolsillos con 0 smells y 100% de cobertura). Los valores 'después' son los esperados; la 2.ª corrida los confirmará.</w:t>
       </w:r>
     </w:p>
     <w:p>

</xml_diff>